<commit_message>
docs(tcc): adicionar artefatos de apresentação v2
Made-with: Cursor
</commit_message>
<xml_diff>
--- a/tcc/[TCC] - Simone Rossetti Nobre Naxara v1.docx
+++ b/tcc/[TCC] - Simone Rossetti Nobre Naxara v1.docx
@@ -1176,6 +1176,7 @@
         <w:rPr>
           <w:b/>
           <w:bCs/>
+          <w:noProof/>
         </w:rPr>
         <w:drawing>
           <wp:inline distT="0" distB="0" distL="0" distR="0" wp14:anchorId="1E538B23" wp14:editId="607F2554">
@@ -1527,13 +1528,7 @@
         <w:ind w:firstLine="708"/>
       </w:pPr>
       <w:r>
-        <w:t>Ao modelar "BusinessCapabilities" como entidades no grafo, cria-se uma ponte semântica que conecta o feedback textual dos usuários à estrutura organizacional do desenvolvimento. Quando uma "issue" é associada a uma "BusinessCapability", o sistema vai além da simples identificação do problema técnico</w:t>
-      </w:r>
-      <w:r>
-        <w:t xml:space="preserve">, </w:t>
-      </w:r>
-      <w:r>
-        <w:t xml:space="preserve">sinaliza qual capacidade de negócio foi impactada. Essa conexão facilita significativamente a comunicação entre equipes de produto, desenvolvimento e negócio, pois traduz problemas técnicos em termos que fazem sentido para diferentes "stakeholders". A abordagem encontra ressonância nos princípios de </w:t>
+        <w:t xml:space="preserve">Ao modelar "BusinessCapabilities" como entidades no grafo, cria-se uma ponte semântica que conecta o feedback textual dos usuários à estrutura organizacional do desenvolvimento. Quando uma "issue" é associada a uma "BusinessCapability", o sistema vai além da simples identificação do problema técnico, sinaliza qual capacidade de negócio foi impactada. Essa conexão facilita significativamente a comunicação entre equipes de produto, desenvolvimento e negócio, pois traduz problemas técnicos em termos que fazem sentido para diferentes "stakeholders". A abordagem encontra ressonância nos princípios de </w:t>
       </w:r>
       <w:r>
         <w:lastRenderedPageBreak/>
@@ -2175,13 +2170,7 @@
         <w:rPr>
           <w:color w:val="000000"/>
         </w:rPr>
-        <w:t xml:space="preserve">Na rodada piloto, foi gerado o relatório em Markdown `Documentos/backlog_priorizado.md`, com **200** avaliações negativas processadas em **02/12/2025** e modelo **GPT-4o**. A Figura 3 apresenta esse modelo de report executivo em leitura compacta, priorizando a tomada de decisão rápida no comitê de backlog. As análises quantitativas desta pesquisa permanecem baseadas no recorte principal de 100 comentários negativos do </w:t>
-      </w:r>
-      <w:r>
-        <w:rPr>
-          <w:color w:val="000000"/>
-        </w:rPr>
-        <w:t>aplicativo</w:t>
+        <w:t>Na rodada piloto, foi gerado o relatório em Markdown `Documentos/backlog_priorizado.md`, com **200** avaliações negativas processadas em **02/12/2025** e modelo **GPT-4o**. A Figura 3 apresenta esse modelo de report executivo em leitura compacta, priorizando a tomada de decisão rápida no comitê de backlog. As análises quantitativas desta pesquisa permanecem baseadas no recorte principal de 100 comentários negativos do aplicativo</w:t>
       </w:r>
       <w:r>
         <w:rPr>
@@ -2205,6 +2194,7 @@
       </w:pPr>
       <w:r>
         <w:rPr>
+          <w:noProof/>
           <w:color w:val="000000"/>
         </w:rPr>
         <w:lastRenderedPageBreak/>
@@ -2741,6 +2731,7 @@
       </w:pPr>
       <w:r>
         <w:rPr>
+          <w:noProof/>
           <w:color w:val="000000"/>
         </w:rPr>
         <w:lastRenderedPageBreak/>
@@ -2837,6 +2828,7 @@
       </w:pPr>
       <w:r>
         <w:rPr>
+          <w:noProof/>
           <w:color w:val="000000"/>
         </w:rPr>
         <w:drawing>
@@ -3474,6 +3466,7 @@
       </w:pPr>
       <w:r>
         <w:rPr>
+          <w:noProof/>
           <w:color w:val="000000"/>
         </w:rPr>
         <w:drawing>
@@ -4788,6 +4781,7 @@
       </w:pPr>
       <w:r>
         <w:rPr>
+          <w:noProof/>
           <w:color w:val="000000"/>
         </w:rPr>
         <w:drawing>
@@ -6091,6 +6085,7 @@
         <w:rPr>
           <w:b/>
           <w:bCs/>
+          <w:noProof/>
           <w:color w:val="000000"/>
         </w:rPr>
         <w:drawing>
@@ -8655,6 +8650,7 @@
       </w:pPr>
       <w:r>
         <w:rPr>
+          <w:noProof/>
           <w:color w:val="000000"/>
         </w:rPr>
         <w:lastRenderedPageBreak/>
@@ -9019,19 +9015,7 @@
         <w:rPr>
           <w:color w:val="000000"/>
         </w:rPr>
-        <w:t xml:space="preserve">A proposta ganha escala quando o feedback real entra na rotina de QA, com mais previsibilidade do que a leitura manual em planilhas. Para justificar prioridade em comitê, o grafo oferece vocabulário comum entre produto, desenvolvimento e testes. Com isso, torna-se possível demonstrar </w:t>
-      </w:r>
-      <w:r>
-        <w:rPr>
-          <w:color w:val="000000"/>
-        </w:rPr>
-        <w:t>porque</w:t>
-      </w:r>
-      <w:r>
-        <w:rPr>
-          <w:color w:val="000000"/>
-        </w:rPr>
-        <w:t xml:space="preserve"> uma capacidade pede atenção e como essa evidência se conecta à voz do usuário nas lojas e, no uso interno, aos defeitos registrados, sempre com respeito à confidencialidade.</w:t>
+        <w:t>A proposta ganha escala quando o feedback real entra na rotina de QA, com mais previsibilidade do que a leitura manual em planilhas. Para justificar prioridade em comitê, o grafo oferece vocabulário comum entre produto, desenvolvimento e testes. Com isso, torna-se possível demonstrar porque uma capacidade pede atenção e como essa evidência se conecta à voz do usuário nas lojas e, no uso interno, aos defeitos registrados, sempre com respeito à confidencialidade.</w:t>
       </w:r>
     </w:p>
     <w:p>
@@ -12985,6 +12969,7 @@
   <w:style w:type="character" w:default="1" w:styleId="Fontepargpadro">
     <w:name w:val="Default Paragraph Font"/>
     <w:uiPriority w:val="1"/>
+    <w:semiHidden/>
     <w:unhideWhenUsed/>
   </w:style>
   <w:style w:type="table" w:default="1" w:styleId="Tabelanormal">
@@ -13709,6 +13694,26 @@
 </file>
 
 <file path=customXml/item2.xml><?xml version="1.0" encoding="utf-8"?>
+<?mso-contentType ?>
+<FormTemplates xmlns="http://schemas.microsoft.com/sharepoint/v3/contenttype/forms">
+  <Display>DocumentLibraryForm</Display>
+  <Edit>DocumentLibraryForm</Edit>
+  <New>DocumentLibraryForm</New>
+</FormTemplates>
+</file>
+
+<file path=customXml/item3.xml><?xml version="1.0" encoding="utf-8"?>
+<p:properties xmlns:p="http://schemas.microsoft.com/office/2006/metadata/properties" xmlns:xsi="http://www.w3.org/2001/XMLSchema-instance" xmlns:pc="http://schemas.microsoft.com/office/infopath/2007/PartnerControls">
+  <documentManagement>
+    <lcf76f155ced4ddcb4097134ff3c332f xmlns="1e7d8aaf-77fb-4419-819f-502bcc31ffe3">
+      <Terms xmlns="http://schemas.microsoft.com/office/infopath/2007/PartnerControls"/>
+    </lcf76f155ced4ddcb4097134ff3c332f>
+    <TaxCatchAll xmlns="2c89dc19-a755-4b1f-8ccb-ddc282e02978" xsi:nil="true"/>
+  </documentManagement>
+</p:properties>
+</file>
+
+<file path=customXml/item4.xml><?xml version="1.0" encoding="utf-8"?>
 <ct:contentTypeSchema xmlns:ct="http://schemas.microsoft.com/office/2006/metadata/contentType" xmlns:ma="http://schemas.microsoft.com/office/2006/metadata/properties/metaAttributes" ct:_="" ma:_="" ma:contentTypeName="Documento" ma:contentTypeID="0x01010008CFA7B293EDBE4DB98FBC161D82B39F" ma:contentTypeVersion="15" ma:contentTypeDescription="Crie um novo documento." ma:contentTypeScope="" ma:versionID="ed78836dbbd60ef5b47f46abba0ddc66">
   <xsd:schema xmlns:xsd="http://www.w3.org/2001/XMLSchema" xmlns:xs="http://www.w3.org/2001/XMLSchema" xmlns:p="http://schemas.microsoft.com/office/2006/metadata/properties" xmlns:ns2="2c89dc19-a755-4b1f-8ccb-ddc282e02978" xmlns:ns3="1e7d8aaf-77fb-4419-819f-502bcc31ffe3" targetNamespace="http://schemas.microsoft.com/office/2006/metadata/properties" ma:root="true" ma:fieldsID="f28b1225859e7fd7734d1009df438026" ns2:_="" ns3:_="">
     <xsd:import namespace="2c89dc19-a755-4b1f-8ccb-ddc282e02978"/>
@@ -13943,26 +13948,6 @@
 </ct:contentTypeSchema>
 </file>
 
-<file path=customXml/item3.xml><?xml version="1.0" encoding="utf-8"?>
-<p:properties xmlns:p="http://schemas.microsoft.com/office/2006/metadata/properties" xmlns:xsi="http://www.w3.org/2001/XMLSchema-instance" xmlns:pc="http://schemas.microsoft.com/office/infopath/2007/PartnerControls">
-  <documentManagement>
-    <lcf76f155ced4ddcb4097134ff3c332f xmlns="1e7d8aaf-77fb-4419-819f-502bcc31ffe3">
-      <Terms xmlns="http://schemas.microsoft.com/office/infopath/2007/PartnerControls"/>
-    </lcf76f155ced4ddcb4097134ff3c332f>
-    <TaxCatchAll xmlns="2c89dc19-a755-4b1f-8ccb-ddc282e02978" xsi:nil="true"/>
-  </documentManagement>
-</p:properties>
-</file>
-
-<file path=customXml/item4.xml><?xml version="1.0" encoding="utf-8"?>
-<?mso-contentType ?>
-<FormTemplates xmlns="http://schemas.microsoft.com/sharepoint/v3/contenttype/forms">
-  <Display>DocumentLibraryForm</Display>
-  <Edit>DocumentLibraryForm</Edit>
-  <New>DocumentLibraryForm</New>
-</FormTemplates>
-</file>
-
 <file path=customXml/itemProps1.xml><?xml version="1.0" encoding="utf-8"?>
 <ds:datastoreItem xmlns:ds="http://schemas.openxmlformats.org/officeDocument/2006/customXml" ds:itemID="{53283E2C-7B56-4C98-A7E3-CFA7266D125B}">
   <ds:schemaRefs>
@@ -13972,6 +13957,25 @@
 </file>
 
 <file path=customXml/itemProps2.xml><?xml version="1.0" encoding="utf-8"?>
+<ds:datastoreItem xmlns:ds="http://schemas.openxmlformats.org/officeDocument/2006/customXml" ds:itemID="{36B1F55A-1B2E-4506-A75A-A779262F9C9D}">
+  <ds:schemaRefs>
+    <ds:schemaRef ds:uri="http://schemas.microsoft.com/sharepoint/v3/contenttype/forms"/>
+  </ds:schemaRefs>
+</ds:datastoreItem>
+</file>
+
+<file path=customXml/itemProps3.xml><?xml version="1.0" encoding="utf-8"?>
+<ds:datastoreItem xmlns:ds="http://schemas.openxmlformats.org/officeDocument/2006/customXml" ds:itemID="{0BFFF7C0-7312-4E0E-A444-E10184C0C7F1}">
+  <ds:schemaRefs>
+    <ds:schemaRef ds:uri="http://schemas.microsoft.com/office/2006/metadata/properties"/>
+    <ds:schemaRef ds:uri="http://schemas.microsoft.com/office/infopath/2007/PartnerControls"/>
+    <ds:schemaRef ds:uri="1e7d8aaf-77fb-4419-819f-502bcc31ffe3"/>
+    <ds:schemaRef ds:uri="2c89dc19-a755-4b1f-8ccb-ddc282e02978"/>
+  </ds:schemaRefs>
+</ds:datastoreItem>
+</file>
+
+<file path=customXml/itemProps4.xml><?xml version="1.0" encoding="utf-8"?>
 <ds:datastoreItem xmlns:ds="http://schemas.openxmlformats.org/officeDocument/2006/customXml" ds:itemID="{F58AD907-4B6B-438E-930A-AF1D9E8983ED}">
   <ds:schemaRefs>
     <ds:schemaRef ds:uri="http://schemas.microsoft.com/office/2006/metadata/contentType"/>
@@ -13990,25 +13994,6 @@
 </ds:datastoreItem>
 </file>
 
-<file path=customXml/itemProps3.xml><?xml version="1.0" encoding="utf-8"?>
-<ds:datastoreItem xmlns:ds="http://schemas.openxmlformats.org/officeDocument/2006/customXml" ds:itemID="{0BFFF7C0-7312-4E0E-A444-E10184C0C7F1}">
-  <ds:schemaRefs>
-    <ds:schemaRef ds:uri="http://schemas.microsoft.com/office/2006/metadata/properties"/>
-    <ds:schemaRef ds:uri="http://schemas.microsoft.com/office/infopath/2007/PartnerControls"/>
-    <ds:schemaRef ds:uri="1e7d8aaf-77fb-4419-819f-502bcc31ffe3"/>
-    <ds:schemaRef ds:uri="2c89dc19-a755-4b1f-8ccb-ddc282e02978"/>
-  </ds:schemaRefs>
-</ds:datastoreItem>
-</file>
-
-<file path=customXml/itemProps4.xml><?xml version="1.0" encoding="utf-8"?>
-<ds:datastoreItem xmlns:ds="http://schemas.openxmlformats.org/officeDocument/2006/customXml" ds:itemID="{36B1F55A-1B2E-4506-A75A-A779262F9C9D}">
-  <ds:schemaRefs>
-    <ds:schemaRef ds:uri="http://schemas.microsoft.com/sharepoint/v3/contenttype/forms"/>
-  </ds:schemaRefs>
-</ds:datastoreItem>
-</file>
-
 <file path=docMetadata/LabelInfo.xml><?xml version="1.0" encoding="utf-8"?>
 <clbl:labelList xmlns:clbl="http://schemas.microsoft.com/office/2020/mipLabelMetadata">
   <clbl:label id="{82f8ba2e-e556-4931-b5c8-1c162999bc23}" enabled="1" method="Standard" siteId="{87543db4-df13-4f35-995f-057e7aa99437}" removed="0"/>

</xml_diff>